<commit_message>
train and test dqn
</commit_message>
<xml_diff>
--- a/The Virtual PULSR Environment.docx
+++ b/The Virtual PULSR Environment.docx
@@ -228,279 +228,8 @@
       <w:r>
         <w:t xml:space="preserve">Reward Function: </w:t>
       </w:r>
-    </w:p>
-    <w:tbl>
-      <w:tblPr>
-        <w:tblStyle w:val="TableGrid"/>
-        <w:tblW w:w="0" w:type="auto"/>
-        <w:jc w:val="center"/>
-        <w:tblLook w:val="04A0" w:firstRow="1" w:lastRow="0" w:firstColumn="1" w:lastColumn="0" w:noHBand="0" w:noVBand="1"/>
-      </w:tblPr>
-      <w:tblGrid>
-        <w:gridCol w:w="2721"/>
-        <w:gridCol w:w="951"/>
-      </w:tblGrid>
-      <w:tr>
-        <w:trPr>
-          <w:jc w:val="center"/>
-        </w:trPr>
-        <w:tc>
-          <w:tcPr>
-            <w:tcW w:w="0" w:type="auto"/>
-          </w:tcPr>
-          <w:p>
-            <w:r>
-              <w:t>Final Score of the Episode</w:t>
-            </w:r>
-          </w:p>
-        </w:tc>
-        <w:tc>
-          <w:tcPr>
-            <w:tcW w:w="0" w:type="auto"/>
-          </w:tcPr>
-          <w:p>
-            <w:r>
-              <w:t>Reward</w:t>
-            </w:r>
-          </w:p>
-        </w:tc>
-      </w:tr>
-      <w:tr>
-        <w:trPr>
-          <w:jc w:val="center"/>
-        </w:trPr>
-        <w:tc>
-          <w:tcPr>
-            <w:tcW w:w="0" w:type="auto"/>
-          </w:tcPr>
-          <w:p>
-            <w:r>
-              <w:t>&gt;150</w:t>
-            </w:r>
-          </w:p>
-        </w:tc>
-        <w:tc>
-          <w:tcPr>
-            <w:tcW w:w="0" w:type="auto"/>
-          </w:tcPr>
-          <w:p>
-            <w:r>
-              <w:t>3</w:t>
-            </w:r>
-          </w:p>
-        </w:tc>
-      </w:tr>
-      <w:tr>
-        <w:trPr>
-          <w:jc w:val="center"/>
-        </w:trPr>
-        <w:tc>
-          <w:tcPr>
-            <w:tcW w:w="0" w:type="auto"/>
-          </w:tcPr>
-          <w:p>
-            <w:r>
-              <w:t>100 – 150</w:t>
-            </w:r>
-          </w:p>
-        </w:tc>
-        <w:tc>
-          <w:tcPr>
-            <w:tcW w:w="0" w:type="auto"/>
-          </w:tcPr>
-          <w:p>
-            <w:r>
-              <w:t>2</w:t>
-            </w:r>
-          </w:p>
-        </w:tc>
-      </w:tr>
-      <w:tr>
-        <w:trPr>
-          <w:jc w:val="center"/>
-        </w:trPr>
-        <w:tc>
-          <w:tcPr>
-            <w:tcW w:w="0" w:type="auto"/>
-          </w:tcPr>
-          <w:p>
-            <w:r>
-              <w:t>90 – 100</w:t>
-            </w:r>
-          </w:p>
-        </w:tc>
-        <w:tc>
-          <w:tcPr>
-            <w:tcW w:w="0" w:type="auto"/>
-          </w:tcPr>
-          <w:p>
-            <w:r>
-              <w:t>1</w:t>
-            </w:r>
-          </w:p>
-        </w:tc>
-      </w:tr>
-      <w:tr>
-        <w:trPr>
-          <w:jc w:val="center"/>
-        </w:trPr>
-        <w:tc>
-          <w:tcPr>
-            <w:tcW w:w="0" w:type="auto"/>
-          </w:tcPr>
-          <w:p>
-            <w:r>
-              <w:t>90</w:t>
-            </w:r>
-          </w:p>
-        </w:tc>
-        <w:tc>
-          <w:tcPr>
-            <w:tcW w:w="0" w:type="auto"/>
-          </w:tcPr>
-          <w:p>
-            <w:r>
-              <w:t>0</w:t>
-            </w:r>
-          </w:p>
-        </w:tc>
-      </w:tr>
-      <w:tr>
-        <w:trPr>
-          <w:jc w:val="center"/>
-        </w:trPr>
-        <w:tc>
-          <w:tcPr>
-            <w:tcW w:w="0" w:type="auto"/>
-          </w:tcPr>
-          <w:p>
-            <w:r>
-              <w:t>70 – 90</w:t>
-            </w:r>
-          </w:p>
-        </w:tc>
-        <w:tc>
-          <w:tcPr>
-            <w:tcW w:w="0" w:type="auto"/>
-          </w:tcPr>
-          <w:p>
-            <w:r>
-              <w:t>-1</w:t>
-            </w:r>
-          </w:p>
-        </w:tc>
-      </w:tr>
-      <w:tr>
-        <w:trPr>
-          <w:jc w:val="center"/>
-        </w:trPr>
-        <w:tc>
-          <w:tcPr>
-            <w:tcW w:w="0" w:type="auto"/>
-          </w:tcPr>
-          <w:p>
-            <w:r>
-              <w:t>50 – 70</w:t>
-            </w:r>
-          </w:p>
-        </w:tc>
-        <w:tc>
-          <w:tcPr>
-            <w:tcW w:w="0" w:type="auto"/>
-          </w:tcPr>
-          <w:p>
-            <w:r>
-              <w:t>-2</w:t>
-            </w:r>
-          </w:p>
-        </w:tc>
-      </w:tr>
-      <w:tr>
-        <w:trPr>
-          <w:jc w:val="center"/>
-        </w:trPr>
-        <w:tc>
-          <w:tcPr>
-            <w:tcW w:w="0" w:type="auto"/>
-          </w:tcPr>
-          <w:p>
-            <w:r>
-              <w:t>&lt;50</w:t>
-            </w:r>
-          </w:p>
-        </w:tc>
-        <w:tc>
-          <w:tcPr>
-            <w:tcW w:w="0" w:type="auto"/>
-          </w:tcPr>
-          <w:p>
-            <w:r>
-              <w:t>-3</w:t>
-            </w:r>
-          </w:p>
-        </w:tc>
-      </w:tr>
-    </w:tbl>
-    <w:p>
-      <w:pPr>
-        <w:pStyle w:val="ListParagraph"/>
-        <w:jc w:val="center"/>
-      </w:pPr>
-    </w:p>
-    <w:p>
-      <w:pPr>
-        <w:pStyle w:val="ListParagraph"/>
-        <w:jc w:val="center"/>
-      </w:pPr>
-      <w:r>
-        <w:t xml:space="preserve">Reward Per </w:t>
-      </w:r>
-      <w:proofErr w:type="gramStart"/>
-      <w:r>
-        <w:t>Step  =</w:t>
-      </w:r>
-      <w:proofErr w:type="gramEnd"/>
-      <w:r>
-        <w:t xml:space="preserve"> -</w:t>
-      </w:r>
-      <w:r>
-        <w:t>3</w:t>
-      </w:r>
-      <w:r>
-        <w:t xml:space="preserve"> / 239</w:t>
-      </w:r>
-      <w:r>
-        <w:t xml:space="preserve"> approximately -0.01255 (negative because it is trajectory optimization task)</w:t>
-      </w:r>
-    </w:p>
-    <w:p>
-      <w:pPr>
-        <w:pStyle w:val="ListParagraph"/>
-        <w:numPr>
-          <w:ilvl w:val="0"/>
-          <w:numId w:val="1"/>
-        </w:numPr>
-      </w:pPr>
-      <w:r>
-        <w:t xml:space="preserve">Environment Dynamics: If d &gt;=a, the agent chooses actions randomly from the action space until d &lt;=a. Choose a = 50 for start but </w:t>
-      </w:r>
-      <w:r>
-        <w:t>change,</w:t>
-      </w:r>
-      <w:r>
-        <w:t xml:space="preserve"> if need </w:t>
-      </w:r>
-      <w:r>
-        <w:t>be,</w:t>
-      </w:r>
-      <w:r>
-        <w:t xml:space="preserve"> to </w:t>
-      </w:r>
-      <w:r>
-        <w:t>optimize</w:t>
-      </w:r>
-      <w:r>
-        <w:t xml:space="preserve"> score. </w:t>
+      <w:r>
+        <w:t>as described earlier</w:t>
       </w:r>
     </w:p>
     <w:sectPr>
@@ -1677,6 +1406,7 @@
   <w:style w:type="character" w:default="1" w:styleId="DefaultParagraphFont">
     <w:name w:val="Default Paragraph Font"/>
     <w:uiPriority w:val="1"/>
+    <w:semiHidden/>
     <w:unhideWhenUsed/>
   </w:style>
   <w:style w:type="table" w:default="1" w:styleId="TableNormal">

</xml_diff>